<commit_message>
updated manuscript and figures
updated manuscript and figures
</commit_message>
<xml_diff>
--- a/manuscript/1-HCB Revised 2026/HCB_2026-018_Rebuttal Comments.docx
+++ b/manuscript/1-HCB Revised 2026/HCB_2026-018_Rebuttal Comments.docx
@@ -1,6 +1,6 @@
 
 <file path=word/document.xml><?xml version="1.0" encoding="utf-8"?>
-<w:document xmlns:wpc="http://schemas.microsoft.com/office/word/2010/wordprocessingCanvas" xmlns:cx="http://schemas.microsoft.com/office/drawing/2014/chartex" xmlns:cx1="http://schemas.microsoft.com/office/drawing/2015/9/8/chartex" xmlns:cx2="http://schemas.microsoft.com/office/drawing/2015/10/21/chartex" xmlns:cx3="http://schemas.microsoft.com/office/drawing/2016/5/9/chartex" xmlns:cx4="http://schemas.microsoft.com/office/drawing/2016/5/10/chartex" xmlns:cx5="http://schemas.microsoft.com/office/drawing/2016/5/11/chartex" xmlns:cx6="http://schemas.microsoft.com/office/drawing/2016/5/12/chartex" xmlns:cx7="http://schemas.microsoft.com/office/drawing/2016/5/13/chartex" xmlns:cx8="http://schemas.microsoft.com/office/drawing/2016/5/14/chartex" xmlns:mc="http://schemas.openxmlformats.org/markup-compatibility/2006" xmlns:m="http://schemas.openxmlformats.org/officeDocument/2006/math" xmlns:aink="http://schemas.microsoft.com/office/drawing/2016/ink" xmlns:am3d="http://schemas.microsoft.com/office/drawing/2017/model3d" xmlns:oel="http://schemas.microsoft.com/office/2019/extlst" xmlns:r="http://schemas.openxmlformats.org/officeDocument/2006/relationships" xmlns:wp14="http://schemas.microsoft.com/office/word/2010/wordprocessingDrawing" xmlns:wp="http://schemas.openxmlformats.org/drawingml/2006/wordprocessingDrawing" xmlns:wpg="http://schemas.microsoft.com/office/word/2010/wordprocessingGroup" xmlns:wpi="http://schemas.microsoft.com/office/word/2010/wordprocessingInk" xmlns:wps="http://schemas.microsoft.com/office/word/2010/wordprocessingShape" xmlns:o="urn:schemas-microsoft-com:office:office" xmlns:v="urn:schemas-microsoft-com:vml" xmlns:w10="urn:schemas-microsoft-com:office:word" xmlns:w="http://schemas.openxmlformats.org/wordprocessingml/2006/main" xmlns:w14="http://schemas.microsoft.com/office/word/2010/wordml" xmlns:w15="http://schemas.microsoft.com/office/word/2012/wordml" xmlns:w16cex="http://schemas.microsoft.com/office/word/2018/wordml/cex" xmlns:w16cid="http://schemas.microsoft.com/office/word/2016/wordml/cid" xmlns:w16="http://schemas.microsoft.com/office/word/2018/wordml" xmlns:w16sdtdh="http://schemas.microsoft.com/office/word/2020/wordml/sdtdatahash" xmlns:w16sdtfl="http://schemas.microsoft.com/office/word/2024/wordml/sdtformatlock" xmlns:w16se="http://schemas.microsoft.com/office/word/2015/wordml/symex" xmlns:w16du="http://schemas.microsoft.com/office/word/2023/wordml/word16du" xmlns:wne="http://schemas.microsoft.com/office/word/2006/wordml" mc:Ignorable="w14 w15 w16se w16cid w16 w16cex w16sdtdh w16sdtfl w16du wp14">
+<w:document xmlns:wpc="http://schemas.microsoft.com/office/word/2010/wordprocessingCanvas" xmlns:cx="http://schemas.microsoft.com/office/drawing/2014/chartex" xmlns:cx1="http://schemas.microsoft.com/office/drawing/2015/9/8/chartex" xmlns:cx2="http://schemas.microsoft.com/office/drawing/2015/10/21/chartex" xmlns:cx3="http://schemas.microsoft.com/office/drawing/2016/5/9/chartex" xmlns:cx4="http://schemas.microsoft.com/office/drawing/2016/5/10/chartex" xmlns:cx5="http://schemas.microsoft.com/office/drawing/2016/5/11/chartex" xmlns:cx6="http://schemas.microsoft.com/office/drawing/2016/5/12/chartex" xmlns:cx7="http://schemas.microsoft.com/office/drawing/2016/5/13/chartex" xmlns:cx8="http://schemas.microsoft.com/office/drawing/2016/5/14/chartex" xmlns:mc="http://schemas.openxmlformats.org/markup-compatibility/2006" xmlns:m="http://schemas.openxmlformats.org/officeDocument/2006/math" xmlns:aink="http://schemas.microsoft.com/office/drawing/2016/ink" xmlns:am3d="http://schemas.microsoft.com/office/drawing/2017/model3d" xmlns:oel="http://schemas.microsoft.com/office/2019/extlst" xmlns:r="http://schemas.openxmlformats.org/officeDocument/2006/relationships" xmlns:wp14="http://schemas.microsoft.com/office/word/2010/wordprocessingDrawing" xmlns:wp="http://schemas.openxmlformats.org/drawingml/2006/wordprocessingDrawing" xmlns:wpg="http://schemas.microsoft.com/office/word/2010/wordprocessingGroup" xmlns:wpi="http://schemas.microsoft.com/office/word/2010/wordprocessingInk" xmlns:wps="http://schemas.microsoft.com/office/word/2010/wordprocessingShape" xmlns:o="urn:schemas-microsoft-com:office:office" xmlns:v="urn:schemas-microsoft-com:vml" xmlns:w10="urn:schemas-microsoft-com:office:word" xmlns:w="http://schemas.openxmlformats.org/wordprocessingml/2006/main" xmlns:w14="http://schemas.microsoft.com/office/word/2010/wordml" xmlns:w15="http://schemas.microsoft.com/office/word/2012/wordml" xmlns:w16cei="http://schemas.microsoft.com/office/word/2026/wordml/cei" xmlns:w16cex="http://schemas.microsoft.com/office/word/2018/wordml/cex" xmlns:w16cid="http://schemas.microsoft.com/office/word/2016/wordml/cid" xmlns:w16="http://schemas.microsoft.com/office/word/2018/wordml" xmlns:w16sdtdh="http://schemas.microsoft.com/office/word/2020/wordml/sdtdatahash" xmlns:w16sdtfl="http://schemas.microsoft.com/office/word/2024/wordml/sdtformatlock" xmlns:w16se="http://schemas.microsoft.com/office/word/2015/wordml/symex" xmlns:w16du="http://schemas.microsoft.com/office/word/2023/wordml/word16du" xmlns:wne="http://schemas.microsoft.com/office/word/2006/wordml" mc:Ignorable="w14 w15 w16se w16cid w16 w16cex w16sdtdh w16sdtfl w16du wp14">
   <w:body>
     <w:p>
       <w:pPr>
@@ -409,14 +409,12 @@
         </w:rPr>
         <w:t xml:space="preserve">Under the assumption that detectability is homogenous in space...Maybe the main body discusses this </w:t>
       </w:r>
-      <w:proofErr w:type="gramStart"/>
-      <w:r>
-        <w:rPr>
-          <w:rFonts w:ascii="Times New Roman" w:hAnsi="Times New Roman" w:cs="Times New Roman"/>
-        </w:rPr>
-        <w:t>more, but</w:t>
-      </w:r>
-      <w:proofErr w:type="gramEnd"/>
+      <w:r>
+        <w:rPr>
+          <w:rFonts w:ascii="Times New Roman" w:hAnsi="Times New Roman" w:cs="Times New Roman"/>
+        </w:rPr>
+        <w:t>more but</w:t>
+      </w:r>
       <w:r>
         <w:rPr>
           <w:rFonts w:ascii="Times New Roman" w:hAnsi="Times New Roman" w:cs="Times New Roman"/>
@@ -605,7 +603,6 @@
         </w:rPr>
         <w:t xml:space="preserve">We used </w:t>
       </w:r>
-      <w:proofErr w:type="gramStart"/>
       <w:r>
         <w:rPr>
           <w:rFonts w:ascii="Times New Roman" w:hAnsi="Times New Roman" w:cs="Times New Roman"/>
@@ -618,9 +615,8 @@
           <w:rFonts w:ascii="Times New Roman" w:hAnsi="Times New Roman" w:cs="Times New Roman"/>
           <w:color w:val="0432FF"/>
         </w:rPr>
-        <w:t>rinciple</w:t>
-      </w:r>
-      <w:proofErr w:type="gramEnd"/>
+        <w:t>rincipal</w:t>
+      </w:r>
       <w:r>
         <w:rPr>
           <w:rFonts w:ascii="Times New Roman" w:hAnsi="Times New Roman" w:cs="Times New Roman"/>
@@ -2209,7 +2205,21 @@
           <w:rFonts w:ascii="Times New Roman" w:hAnsi="Times New Roman" w:cs="Times New Roman"/>
           <w:color w:val="0432FF"/>
         </w:rPr>
-        <w:t xml:space="preserve"> This map clearly shows that the entire wetland at the study cite was surveyed, that Cottonmouths were (unsurprisingly) restricted to wetland areas, and that potential habitat areas outside the wetland were surveyed and considered to be potential habitat (random points)</w:t>
+        <w:t xml:space="preserve"> This map clearly shows that the entire wetland at the study </w:t>
+      </w:r>
+      <w:r>
+        <w:rPr>
+          <w:rFonts w:ascii="Times New Roman" w:hAnsi="Times New Roman" w:cs="Times New Roman"/>
+          <w:color w:val="0432FF"/>
+        </w:rPr>
+        <w:t>s</w:t>
+      </w:r>
+      <w:r>
+        <w:rPr>
+          <w:rFonts w:ascii="Times New Roman" w:hAnsi="Times New Roman" w:cs="Times New Roman"/>
+          <w:color w:val="0432FF"/>
+        </w:rPr>
+        <w:t>ite was surveyed, that Cottonmouths were (unsurprisingly) restricted to wetland areas, and that potential habitat areas outside the wetland were surveyed and considered to be potential habitat (random points)</w:t>
       </w:r>
       <w:r>
         <w:rPr>
@@ -2281,7 +2291,28 @@
           <w:rFonts w:ascii="Times New Roman" w:hAnsi="Times New Roman" w:cs="Times New Roman"/>
           <w:color w:val="0432FF"/>
         </w:rPr>
-        <w:t xml:space="preserve">added details for conducting surveys. Searching was done haphazardly but covered the entirety of the wetland (map in Figure 1) at some point. This strategy may have some bias, but no more than might be expected of a telemetric study where individual variation and </w:t>
+        <w:t xml:space="preserve">added details for conducting surveys. Searching was done haphazardly but covered the entirety of the wetland </w:t>
+      </w:r>
+      <w:r>
+        <w:rPr>
+          <w:rFonts w:ascii="Times New Roman" w:hAnsi="Times New Roman" w:cs="Times New Roman"/>
+          <w:color w:val="0432FF"/>
+        </w:rPr>
+        <w:t>at some point</w:t>
+      </w:r>
+      <w:r>
+        <w:rPr>
+          <w:rFonts w:ascii="Times New Roman" w:hAnsi="Times New Roman" w:cs="Times New Roman"/>
+          <w:color w:val="0432FF"/>
+        </w:rPr>
+        <w:t xml:space="preserve"> </w:t>
+      </w:r>
+      <w:r>
+        <w:rPr>
+          <w:rFonts w:ascii="Times New Roman" w:hAnsi="Times New Roman" w:cs="Times New Roman"/>
+          <w:color w:val="0432FF"/>
+        </w:rPr>
+        <w:t xml:space="preserve">(map in Figure 1). This strategy may have some bias, but no more than might be expected of a telemetric study where individual variation and </w:t>
       </w:r>
       <w:r>
         <w:rPr>
@@ -2410,6 +2441,21 @@
       <w:pPr>
         <w:rPr>
           <w:rFonts w:ascii="Times New Roman" w:hAnsi="Times New Roman" w:cs="Times New Roman"/>
+          <w:color w:val="0432FF"/>
+        </w:rPr>
+      </w:pPr>
+      <w:r>
+        <w:rPr>
+          <w:rFonts w:ascii="Times New Roman" w:hAnsi="Times New Roman" w:cs="Times New Roman"/>
+          <w:color w:val="0432FF"/>
+        </w:rPr>
+        <w:t xml:space="preserve">We were not always able to determine whether a female was gravid. Early in the sampling season female reproductive status is not obvious. We attempted to account for this by not including gravid females in analyses. </w:t>
+      </w:r>
+    </w:p>
+    <w:p>
+      <w:pPr>
+        <w:rPr>
+          <w:rFonts w:ascii="Times New Roman" w:hAnsi="Times New Roman" w:cs="Times New Roman"/>
         </w:rPr>
       </w:pPr>
       <w:r>
@@ -2685,6 +2731,7 @@
           <w:rFonts w:ascii="Times New Roman" w:hAnsi="Times New Roman" w:cs="Times New Roman"/>
           <w:color w:val="0432FF"/>
         </w:rPr>
+        <w:lastRenderedPageBreak/>
         <w:t xml:space="preserve">We argue that </w:t>
       </w:r>
       <w:r>
@@ -2692,15 +2739,7 @@
           <w:rFonts w:ascii="Times New Roman" w:hAnsi="Times New Roman" w:cs="Times New Roman"/>
           <w:color w:val="0432FF"/>
         </w:rPr>
-        <w:t xml:space="preserve">generalist use of habitat features in a type of habitat selection (generalized). If habitat selection can be viewed on a continuum from use of only specific habitat features to general use of most or all habitat features, cottonmouths are more generalized. We have added </w:t>
-      </w:r>
-      <w:r>
-        <w:rPr>
-          <w:rFonts w:ascii="Times New Roman" w:hAnsi="Times New Roman" w:cs="Times New Roman"/>
-          <w:color w:val="0432FF"/>
-        </w:rPr>
-        <w:lastRenderedPageBreak/>
-        <w:t>words clarifying that the distribution of available habitat features was wider than the distribution of features used by cottonmouths (e.g. used in different relative abundance, proportion, etc. – data from PCA analysis supports this)</w:t>
+        <w:t>generalist use of habitat features in a type of habitat selection (generalized). If habitat selection can be viewed on a continuum from use of only specific habitat features to general use of most or all habitat features, cottonmouths are more generalized. We have added words clarifying that the distribution of available habitat features was wider than the distribution of features used by cottonmouths (e.g. used in different relative abundance, proportion, etc. – data from PCA analysis supports this)</w:t>
       </w:r>
     </w:p>
     <w:p>
@@ -4547,6 +4586,7 @@
   <w:style w:type="character" w:default="1" w:styleId="DefaultParagraphFont">
     <w:name w:val="Default Paragraph Font"/>
     <w:uiPriority w:val="1"/>
+    <w:semiHidden/>
     <w:unhideWhenUsed/>
   </w:style>
   <w:style w:type="table" w:default="1" w:styleId="TableNormal">

</xml_diff>